<commit_message>
Add images to meeting report 03
</commit_message>
<xml_diff>
--- a/docs/JMWG-Meeting report-03-2026.docx
+++ b/docs/JMWG-Meeting report-03-2026.docx
@@ -150,7 +150,62 @@
         <w:t xml:space="preserve">30 April 2026</w:t>
       </w:r>
     </w:p>
-    <w:bookmarkStart w:id="13" w:name="summary"/>
+    <w:p>
+      <w:pPr>
+        <w:pStyle w:val="CaptionedFigure"/>
+      </w:pPr>
+      <w:r>
+        <w:drawing>
+          <wp:inline>
+            <wp:extent cx="5334000" cy="2940174"/>
+            <wp:effectExtent b="0" l="0" r="0" t="0"/>
+            <wp:docPr descr="Participants in the JMWG benchmark-preparation meeting 03/2026." title="" id="13" name="Picture"/>
+            <a:graphic>
+              <a:graphicData uri="http://schemas.openxmlformats.org/drawingml/2006/picture">
+                <pic:pic>
+                  <pic:nvPicPr>
+                    <pic:cNvPr descr="images/JMWG-Meeting-report-03-2026-photo.png" id="14" name="Picture"/>
+                    <pic:cNvPicPr>
+                      <a:picLocks noChangeArrowheads="1" noChangeAspect="1"/>
+                    </pic:cNvPicPr>
+                  </pic:nvPicPr>
+                  <pic:blipFill>
+                    <a:blip r:embed="rId12"/>
+                    <a:stretch>
+                      <a:fillRect/>
+                    </a:stretch>
+                  </pic:blipFill>
+                  <pic:spPr bwMode="auto">
+                    <a:xfrm>
+                      <a:off x="0" y="0"/>
+                      <a:ext cx="5334000" cy="2940174"/>
+                    </a:xfrm>
+                    <a:prstGeom prst="rect">
+                      <a:avLst/>
+                    </a:prstGeom>
+                    <a:noFill/>
+                    <a:ln w="9525">
+                      <a:noFill/>
+                      <a:headEnd/>
+                      <a:tailEnd/>
+                    </a:ln>
+                  </pic:spPr>
+                </pic:pic>
+              </a:graphicData>
+            </a:graphic>
+          </wp:inline>
+        </w:drawing>
+      </w:r>
+    </w:p>
+    <w:p>
+      <w:pPr>
+        <w:pStyle w:val="ImageCaption"/>
+      </w:pPr>
+      <w:r>
+        <w:t xml:space="preserve">Participants in the JMWG benchmark-preparation meeting 03/2026.</w:t>
+      </w:r>
+    </w:p>
+    <w:bookmarkStart w:id="16" w:name="summary"/>
     <w:p>
       <w:pPr>
         <w:pStyle w:val="Heading1"/>
@@ -182,7 +237,7 @@
       <w:r>
         <w:t xml:space="preserve"> </w:t>
       </w:r>
-      <w:hyperlink r:id="rId12">
+      <w:hyperlink r:id="rId15">
         <w:r>
           <w:rPr>
             <w:rStyle w:val="Hyperlink"/>
@@ -218,8 +273,8 @@
         <w:t xml:space="preserve">Participants named in the discussion included Jim Ianelli, Ana Alegre Norza, Criscely Lujan, Miriam Geronimo, Benoit Berges, Ignacio Paya, Karolina Molla Gazi, Luciano Espinoza, Iago Mosqueira, Niels Hintzen, Jose Zenteno, Aquiles Sepulveda, and additional participants from Peru, Chile, the EU, PFA, and collaborating institutions.</w:t>
       </w:r>
     </w:p>
-    <w:bookmarkEnd w:id="13"/>
-    <w:bookmarkStart w:id="14" w:name="meeting-details"/>
+    <w:bookmarkEnd w:id="16"/>
+    <w:bookmarkStart w:id="17" w:name="meeting-details"/>
     <w:p>
       <w:pPr>
         <w:pStyle w:val="Heading1"/>
@@ -288,8 +343,8 @@
         <w:t xml:space="preserve">Main focus: Final benchmark agenda, index and biological-data preparation, assessment/OM linkages, and MSE workflow</w:t>
       </w:r>
     </w:p>
-    <w:bookmarkEnd w:id="14"/>
-    <w:bookmarkStart w:id="15" w:name="key-dates-and-action-times"/>
+    <w:bookmarkEnd w:id="17"/>
+    <w:bookmarkStart w:id="18" w:name="key-dates-and-action-times"/>
     <w:p>
       <w:pPr>
         <w:pStyle w:val="Heading1"/>
@@ -524,8 +579,8 @@
         </w:tc>
       </w:tr>
     </w:tbl>
-    <w:bookmarkEnd w:id="15"/>
-    <w:bookmarkStart w:id="26" w:name="key-discussion-summary"/>
+    <w:bookmarkEnd w:id="18"/>
+    <w:bookmarkStart w:id="29" w:name="key-discussion-summary"/>
     <w:p>
       <w:pPr>
         <w:pStyle w:val="Heading1"/>
@@ -534,7 +589,7 @@
         <w:t xml:space="preserve">Key Discussion Summary</w:t>
       </w:r>
     </w:p>
-    <w:bookmarkStart w:id="16" w:name="X5abb5d02769813d77f58aa075132597effc1981"/>
+    <w:bookmarkStart w:id="19" w:name="X5abb5d02769813d77f58aa075132597effc1981"/>
     <w:p>
       <w:pPr>
         <w:pStyle w:val="Heading2"/>
@@ -603,8 +658,8 @@
         <w:t xml:space="preserve">The group discussed rapporteur support; no dedicated rapporteurs were confirmed, but meeting recording and possible additional note-taking support were identified as options.</w:t>
       </w:r>
     </w:p>
-    <w:bookmarkEnd w:id="16"/>
-    <w:bookmarkStart w:id="17" w:name="X3dd76c15714d8cea88e0fa65c5589748d7fb277"/>
+    <w:bookmarkEnd w:id="19"/>
+    <w:bookmarkStart w:id="20" w:name="X3dd76c15714d8cea88e0fa65c5589748d7fb277"/>
     <w:p>
       <w:pPr>
         <w:pStyle w:val="Heading2"/>
@@ -673,8 +728,8 @@
         <w:t xml:space="preserve">Jim emphasized that the benchmark should produce the main recommendations on data use, model configuration, and MSE inputs rather than require all final MSE products beforehand.</w:t>
       </w:r>
     </w:p>
-    <w:bookmarkEnd w:id="17"/>
-    <w:bookmarkStart w:id="18" w:name="benchmark-agenda-structure"/>
+    <w:bookmarkEnd w:id="20"/>
+    <w:bookmarkStart w:id="21" w:name="benchmark-agenda-structure"/>
     <w:p>
       <w:pPr>
         <w:pStyle w:val="Heading2"/>
@@ -743,8 +798,8 @@
         <w:t xml:space="preserve">The final benchmark report should be adopted quickly enough to support the June MSE workshop and operating-model work.</w:t>
       </w:r>
     </w:p>
-    <w:bookmarkEnd w:id="18"/>
-    <w:bookmarkStart w:id="19" w:name="biological-input-overview"/>
+    <w:bookmarkEnd w:id="21"/>
+    <w:bookmarkStart w:id="22" w:name="biological-input-overview"/>
     <w:p>
       <w:pPr>
         <w:pStyle w:val="Heading2"/>
@@ -801,8 +856,8 @@
         <w:t xml:space="preserve">The group identified this biological-input overview as useful both for benchmark review and for later operating-model conditioning.</w:t>
       </w:r>
     </w:p>
-    <w:bookmarkEnd w:id="19"/>
-    <w:bookmarkStart w:id="20" w:name="X9eb1cb72b7cb1aa9e3bb911e5176cdb2962913d"/>
+    <w:bookmarkEnd w:id="22"/>
+    <w:bookmarkStart w:id="23" w:name="X9eb1cb72b7cb1aa9e3bb911e5176cdb2962913d"/>
     <w:p>
       <w:pPr>
         <w:pStyle w:val="Heading2"/>
@@ -871,8 +926,8 @@
         <w:t xml:space="preserve">Participants agreed that the benchmark should consider the new 2026 information as part of the system reality, while also documenting environmental and availability mechanisms that may affect interpretation.</w:t>
       </w:r>
     </w:p>
-    <w:bookmarkEnd w:id="20"/>
-    <w:bookmarkStart w:id="21" w:name="cpue-and-acoustic-index-treatment-in-jjm"/>
+    <w:bookmarkEnd w:id="23"/>
+    <w:bookmarkStart w:id="24" w:name="cpue-and-acoustic-index-treatment-in-jjm"/>
     <w:p>
       <w:pPr>
         <w:pStyle w:val="Heading2"/>
@@ -941,8 +996,8 @@
         <w:t xml:space="preserve">Niels emphasized that Acoustic North fits poorly in SAM and other diagnostic analyses and that its ecological relationship to the rest of the data remains unclear. He noted that the benchmark assessment should not be expected to mirror Acoustic North directly.</w:t>
       </w:r>
     </w:p>
-    <w:bookmarkEnd w:id="21"/>
-    <w:bookmarkStart w:id="22" w:name="X67f72317430176339648f09a2d422228a420cfc"/>
+    <w:bookmarkEnd w:id="24"/>
+    <w:bookmarkStart w:id="25" w:name="X67f72317430176339648f09a2d422228a420cfc"/>
     <w:p>
       <w:pPr>
         <w:pStyle w:val="Heading2"/>
@@ -999,8 +1054,8 @@
         <w:t xml:space="preserve">Peru also noted ongoing monitoring of the 2026 environmental impacts on jack mackerel in Peruvian waters, where lower catches and juvenile presence have been observed.</w:t>
       </w:r>
     </w:p>
-    <w:bookmarkEnd w:id="22"/>
-    <w:bookmarkStart w:id="23" w:name="X7e4414c4629bd441680fdb5dc6775642d9b6685"/>
+    <w:bookmarkEnd w:id="25"/>
+    <w:bookmarkStart w:id="26" w:name="X7e4414c4629bd441680fdb5dc6775642d9b6685"/>
     <w:p>
       <w:pPr>
         <w:pStyle w:val="Heading2"/>
@@ -1069,8 +1124,8 @@
         <w:t xml:space="preserve">The diagnostic role of SAM remains focused on understanding fit, selectivity grouping, data conflicts, and candidate model configuration rather than replacing JJM as the assessment framework.</w:t>
       </w:r>
     </w:p>
-    <w:bookmarkEnd w:id="23"/>
-    <w:bookmarkStart w:id="24" w:name="operating-model-grid-and-mse-workflow"/>
+    <w:bookmarkEnd w:id="26"/>
+    <w:bookmarkStart w:id="27" w:name="operating-model-grid-and-mse-workflow"/>
     <w:p>
       <w:pPr>
         <w:pStyle w:val="Heading2"/>
@@ -1139,8 +1194,8 @@
         <w:t xml:space="preserve">Ignacio asked about future selectivity transitions from recent estimated selectivity to longer-period average selectivity. Iago clarified that previous Seattle work used a moving-window transition to avoid abrupt jumps, and that the same mechanism can be retained.</w:t>
       </w:r>
     </w:p>
-    <w:bookmarkEnd w:id="24"/>
-    <w:bookmarkStart w:id="25" w:name="Xec4f0c06647d4294c216dd93812c79768aef24f"/>
+    <w:bookmarkEnd w:id="27"/>
+    <w:bookmarkStart w:id="28" w:name="Xec4f0c06647d4294c216dd93812c79768aef24f"/>
     <w:p>
       <w:pPr>
         <w:pStyle w:val="Heading2"/>
@@ -1209,9 +1264,9 @@
         <w:t xml:space="preserve">Iago agreed to add explanatory material and consider diagnostics for combined indices, additional metrics, scatter plots, and possible lagged relationships.</w:t>
       </w:r>
     </w:p>
-    <w:bookmarkEnd w:id="25"/>
-    <w:bookmarkEnd w:id="26"/>
-    <w:bookmarkStart w:id="27" w:name="decisions-and-agreements"/>
+    <w:bookmarkEnd w:id="28"/>
+    <w:bookmarkEnd w:id="29"/>
+    <w:bookmarkStart w:id="30" w:name="decisions-and-agreements"/>
     <w:p>
       <w:pPr>
         <w:pStyle w:val="Heading1"/>
@@ -1304,8 +1359,8 @@
         <w:t xml:space="preserve">The benchmark should produce an agreed OM grid or equivalent table that identifies reference-set and robustness-set uncertainties for the MSE workshop.</w:t>
       </w:r>
     </w:p>
-    <w:bookmarkEnd w:id="27"/>
-    <w:bookmarkStart w:id="28" w:name="action-items"/>
+    <w:bookmarkEnd w:id="30"/>
+    <w:bookmarkStart w:id="31" w:name="action-items"/>
     <w:p>
       <w:pPr>
         <w:pStyle w:val="Heading1"/>
@@ -2067,8 +2122,8 @@
         </w:tc>
       </w:tr>
     </w:tbl>
-    <w:bookmarkEnd w:id="28"/>
-    <w:bookmarkStart w:id="29" w:name="open-issues-risks-to-track"/>
+    <w:bookmarkEnd w:id="31"/>
+    <w:bookmarkStart w:id="32" w:name="open-issues-risks-to-track"/>
     <w:p>
       <w:pPr>
         <w:pStyle w:val="Heading1"/>
@@ -2149,8 +2204,8 @@
         <w:t xml:space="preserve">Remote participation can support selected sessions, but the workshop is not planned as a fully hybrid meeting.</w:t>
       </w:r>
     </w:p>
-    <w:bookmarkEnd w:id="29"/>
-    <w:bookmarkStart w:id="30" w:name="next-step"/>
+    <w:bookmarkEnd w:id="32"/>
+    <w:bookmarkStart w:id="33" w:name="next-step"/>
     <w:p>
       <w:pPr>
         <w:pStyle w:val="Heading1"/>
@@ -2167,8 +2222,8 @@
         <w:t xml:space="preserve">Finalize and circulate the benchmark agenda and updated working-paper expectations before the May benchmark, with special attention to the 7 May submissions, biological-input overview, index-use recommendations, and an OM-grid table that can feed directly into the June MSE workshop.</w:t>
       </w:r>
     </w:p>
-    <w:bookmarkEnd w:id="30"/>
-    <w:bookmarkStart w:id="31" w:name="references"/>
+    <w:bookmarkEnd w:id="33"/>
+    <w:bookmarkStart w:id="37" w:name="references"/>
     <w:p>
       <w:pPr>
         <w:pStyle w:val="Heading1"/>
@@ -2185,7 +2240,62 @@
         <w:t xml:space="preserve">This report is based on the supplied automated transcript for the JMWG benchmark-preparation meeting held on 30 April 2026. It is intended as a meeting-report draft using the same structure and rendering conventions as Meeting reports 01-2026 and 02-2026.</w:t>
       </w:r>
     </w:p>
-    <w:bookmarkEnd w:id="31"/>
+    <w:p>
+      <w:pPr>
+        <w:pStyle w:val="CaptionedFigure"/>
+      </w:pPr>
+      <w:r>
+        <w:drawing>
+          <wp:inline>
+            <wp:extent cx="5334000" cy="3001970"/>
+            <wp:effectExtent b="0" l="0" r="0" t="0"/>
+            <wp:docPr descr="Navigation overview for the JM_SCW_prep assessment hub." title="" id="35" name="Picture"/>
+            <a:graphic>
+              <a:graphicData uri="http://schemas.openxmlformats.org/drawingml/2006/picture">
+                <pic:pic>
+                  <pic:nvPicPr>
+                    <pic:cNvPr descr="images/JMWG-Meeting-report-03-2026-navigation.png" id="36" name="Picture"/>
+                    <pic:cNvPicPr>
+                      <a:picLocks noChangeArrowheads="1" noChangeAspect="1"/>
+                    </pic:cNvPicPr>
+                  </pic:nvPicPr>
+                  <pic:blipFill>
+                    <a:blip r:embed="rId34"/>
+                    <a:stretch>
+                      <a:fillRect/>
+                    </a:stretch>
+                  </pic:blipFill>
+                  <pic:spPr bwMode="auto">
+                    <a:xfrm>
+                      <a:off x="0" y="0"/>
+                      <a:ext cx="5334000" cy="3001970"/>
+                    </a:xfrm>
+                    <a:prstGeom prst="rect">
+                      <a:avLst/>
+                    </a:prstGeom>
+                    <a:noFill/>
+                    <a:ln w="9525">
+                      <a:noFill/>
+                      <a:headEnd/>
+                      <a:tailEnd/>
+                    </a:ln>
+                  </pic:spPr>
+                </pic:pic>
+              </a:graphicData>
+            </a:graphic>
+          </wp:inline>
+        </w:drawing>
+      </w:r>
+    </w:p>
+    <w:p>
+      <w:pPr>
+        <w:pStyle w:val="ImageCaption"/>
+      </w:pPr>
+      <w:r>
+        <w:t xml:space="preserve">Navigation overview for the JM_SCW_prep assessment hub.</w:t>
+      </w:r>
+    </w:p>
+    <w:bookmarkEnd w:id="37"/>
     <w:sectPr>
       <w:footnotePr>
         <w:numRestart w:val="eachSect"/>

</xml_diff>